<commit_message>
Update Otomatik Kontrol Rapor.docx
</commit_message>
<xml_diff>
--- a/Otomatik Kontrol Rapor.docx
+++ b/Otomatik Kontrol Rapor.docx
@@ -195,13 +195,631 @@
     <w:p>
       <w:pPr>
         <w:spacing w:before="100" w:beforeAutospacing="1" w:after="100" w:afterAutospacing="1" w:line="240" w:lineRule="auto"/>
+        <w:rPr>
+          <w:rFonts w:ascii="Times New Roman" w:eastAsia="Times New Roman" w:hAnsi="Times New Roman" w:cs="Times New Roman"/>
+          <w:sz w:val="24"/>
+          <w:szCs w:val="24"/>
+          <w:lang w:eastAsia="tr-TR"/>
+        </w:rPr>
+      </w:pPr>
+    </w:p>
+    <w:p>
+      <w:pPr>
+        <w:spacing w:before="100" w:beforeAutospacing="1" w:after="100" w:afterAutospacing="1" w:line="240" w:lineRule="auto"/>
         <w:jc w:val="center"/>
+        <w:rPr>
+          <w:rFonts w:ascii="Times New Roman" w:eastAsia="Times New Roman" w:hAnsi="Times New Roman" w:cs="Times New Roman"/>
+          <w:sz w:val="24"/>
+          <w:szCs w:val="24"/>
+          <w:lang w:eastAsia="tr-TR"/>
+        </w:rPr>
+      </w:pPr>
+      <w:r>
         <w:rPr>
           <w:rFonts w:ascii="Times New Roman" w:eastAsia="Times New Roman" w:hAnsi="Times New Roman" w:cs="Times New Roman"/>
           <w:sz w:val="40"/>
           <w:szCs w:val="40"/>
           <w:lang w:eastAsia="tr-TR"/>
         </w:rPr>
+        <w:t>SİSTEM VE YOL TANIMI</w:t>
+      </w:r>
+    </w:p>
+    <w:p>
+      <w:pPr>
+        <w:spacing w:after="0" w:line="240" w:lineRule="auto"/>
+        <w:rPr>
+          <w:rFonts w:ascii="Times New Roman" w:eastAsia="Times New Roman" w:hAnsi="Times New Roman" w:cs="Times New Roman"/>
+          <w:sz w:val="24"/>
+          <w:szCs w:val="24"/>
+          <w:lang w:eastAsia="tr-TR"/>
+        </w:rPr>
+      </w:pPr>
+      <w:r>
+        <w:rPr>
+          <w:rFonts w:ascii="Times New Roman" w:eastAsia="Times New Roman" w:hAnsi="Times New Roman" w:cs="Times New Roman"/>
+          <w:sz w:val="24"/>
+          <w:szCs w:val="24"/>
+          <w:lang w:eastAsia="tr-TR"/>
+        </w:rPr>
+        <w:t xml:space="preserve">Simülasyon, </w:t>
+      </w:r>
+      <w:proofErr w:type="spellStart"/>
+      <w:r>
+        <w:rPr>
+          <w:rFonts w:ascii="Times New Roman" w:eastAsia="Times New Roman" w:hAnsi="Times New Roman" w:cs="Times New Roman"/>
+          <w:sz w:val="24"/>
+          <w:szCs w:val="24"/>
+          <w:lang w:eastAsia="tr-TR"/>
+        </w:rPr>
+        <w:t>Unity</w:t>
+      </w:r>
+      <w:proofErr w:type="spellEnd"/>
+      <w:r>
+        <w:rPr>
+          <w:rFonts w:ascii="Times New Roman" w:eastAsia="Times New Roman" w:hAnsi="Times New Roman" w:cs="Times New Roman"/>
+          <w:sz w:val="24"/>
+          <w:szCs w:val="24"/>
+          <w:lang w:eastAsia="tr-TR"/>
+        </w:rPr>
+        <w:t xml:space="preserve"> 6 oyun motoru kullanılarak tasarlanmıştır. Yol modeli, </w:t>
+      </w:r>
+      <w:proofErr w:type="spellStart"/>
+      <w:r>
+        <w:rPr>
+          <w:rFonts w:ascii="Times New Roman" w:eastAsia="Times New Roman" w:hAnsi="Times New Roman" w:cs="Times New Roman"/>
+          <w:sz w:val="24"/>
+          <w:szCs w:val="24"/>
+          <w:lang w:eastAsia="tr-TR"/>
+        </w:rPr>
+        <w:t>Unity</w:t>
+      </w:r>
+      <w:proofErr w:type="spellEnd"/>
+      <w:r>
+        <w:rPr>
+          <w:rFonts w:ascii="Times New Roman" w:eastAsia="Times New Roman" w:hAnsi="Times New Roman" w:cs="Times New Roman"/>
+          <w:sz w:val="24"/>
+          <w:szCs w:val="24"/>
+          <w:lang w:eastAsia="tr-TR"/>
+        </w:rPr>
+        <w:t xml:space="preserve"> </w:t>
+      </w:r>
+      <w:proofErr w:type="spellStart"/>
+      <w:r>
+        <w:rPr>
+          <w:rFonts w:ascii="Times New Roman" w:eastAsia="Times New Roman" w:hAnsi="Times New Roman" w:cs="Times New Roman"/>
+          <w:sz w:val="24"/>
+          <w:szCs w:val="24"/>
+          <w:lang w:eastAsia="tr-TR"/>
+        </w:rPr>
+        <w:t>Splines</w:t>
+      </w:r>
+      <w:proofErr w:type="spellEnd"/>
+      <w:r>
+        <w:rPr>
+          <w:rFonts w:ascii="Times New Roman" w:eastAsia="Times New Roman" w:hAnsi="Times New Roman" w:cs="Times New Roman"/>
+          <w:sz w:val="24"/>
+          <w:szCs w:val="24"/>
+          <w:lang w:eastAsia="tr-TR"/>
+        </w:rPr>
+        <w:t xml:space="preserve"> paketi yardımıyla oluşturulmuş ve fiziksel zemin etkileşimi için sisteme Mesh </w:t>
+      </w:r>
+      <w:proofErr w:type="spellStart"/>
+      <w:r>
+        <w:rPr>
+          <w:rFonts w:ascii="Times New Roman" w:eastAsia="Times New Roman" w:hAnsi="Times New Roman" w:cs="Times New Roman"/>
+          <w:sz w:val="24"/>
+          <w:szCs w:val="24"/>
+          <w:lang w:eastAsia="tr-TR"/>
+        </w:rPr>
+        <w:t>Collider</w:t>
+      </w:r>
+      <w:proofErr w:type="spellEnd"/>
+      <w:r>
+        <w:rPr>
+          <w:rFonts w:ascii="Times New Roman" w:eastAsia="Times New Roman" w:hAnsi="Times New Roman" w:cs="Times New Roman"/>
+          <w:sz w:val="24"/>
+          <w:szCs w:val="24"/>
+          <w:lang w:eastAsia="tr-TR"/>
+        </w:rPr>
+        <w:t xml:space="preserve"> </w:t>
+      </w:r>
+      <w:proofErr w:type="gramStart"/>
+      <w:r>
+        <w:rPr>
+          <w:rFonts w:ascii="Times New Roman" w:eastAsia="Times New Roman" w:hAnsi="Times New Roman" w:cs="Times New Roman"/>
+          <w:sz w:val="24"/>
+          <w:szCs w:val="24"/>
+          <w:lang w:eastAsia="tr-TR"/>
+        </w:rPr>
+        <w:t>entegre</w:t>
+      </w:r>
+      <w:proofErr w:type="gramEnd"/>
+      <w:r>
+        <w:rPr>
+          <w:rFonts w:ascii="Times New Roman" w:eastAsia="Times New Roman" w:hAnsi="Times New Roman" w:cs="Times New Roman"/>
+          <w:sz w:val="24"/>
+          <w:szCs w:val="24"/>
+          <w:lang w:eastAsia="tr-TR"/>
+        </w:rPr>
+        <w:t xml:space="preserve"> edilmiştir. Rota, aracın eylemsizlik ve merkezkaç kuvvetlerine karşı kontrolcü performansının test edilebilmesi amacıyla hem düzlükler hem de hafif/keskin </w:t>
+      </w:r>
+      <w:proofErr w:type="gramStart"/>
+      <w:r>
+        <w:rPr>
+          <w:rFonts w:ascii="Times New Roman" w:eastAsia="Times New Roman" w:hAnsi="Times New Roman" w:cs="Times New Roman"/>
+          <w:sz w:val="24"/>
+          <w:szCs w:val="24"/>
+          <w:lang w:eastAsia="tr-TR"/>
+        </w:rPr>
+        <w:t>virajlar</w:t>
+      </w:r>
+      <w:proofErr w:type="gramEnd"/>
+      <w:r>
+        <w:rPr>
+          <w:rFonts w:ascii="Times New Roman" w:eastAsia="Times New Roman" w:hAnsi="Times New Roman" w:cs="Times New Roman"/>
+          <w:sz w:val="24"/>
+          <w:szCs w:val="24"/>
+          <w:lang w:eastAsia="tr-TR"/>
+        </w:rPr>
+        <w:t xml:space="preserve"> içerecek </w:t>
+      </w:r>
+      <w:proofErr w:type="gramStart"/>
+      <w:r>
+        <w:rPr>
+          <w:rFonts w:ascii="Times New Roman" w:eastAsia="Times New Roman" w:hAnsi="Times New Roman" w:cs="Times New Roman"/>
+          <w:sz w:val="24"/>
+          <w:szCs w:val="24"/>
+          <w:lang w:eastAsia="tr-TR"/>
+        </w:rPr>
+        <w:t>şekilde</w:t>
+      </w:r>
+      <w:proofErr w:type="gramEnd"/>
+      <w:r>
+        <w:rPr>
+          <w:rFonts w:ascii="Times New Roman" w:eastAsia="Times New Roman" w:hAnsi="Times New Roman" w:cs="Times New Roman"/>
+          <w:sz w:val="24"/>
+          <w:szCs w:val="24"/>
+          <w:lang w:eastAsia="tr-TR"/>
+        </w:rPr>
+        <w:t xml:space="preserve"> parametrik olarak bükülmüştür. Simülasyondaki araç, bir </w:t>
+      </w:r>
+      <w:proofErr w:type="spellStart"/>
+      <w:r>
+        <w:rPr>
+          <w:rFonts w:ascii="Times New Roman" w:eastAsia="Times New Roman" w:hAnsi="Times New Roman" w:cs="Times New Roman"/>
+          <w:sz w:val="24"/>
+          <w:szCs w:val="24"/>
+          <w:lang w:eastAsia="tr-TR"/>
+        </w:rPr>
+        <w:t>Rigidbody</w:t>
+      </w:r>
+      <w:proofErr w:type="spellEnd"/>
+      <w:r>
+        <w:rPr>
+          <w:rFonts w:ascii="Times New Roman" w:eastAsia="Times New Roman" w:hAnsi="Times New Roman" w:cs="Times New Roman"/>
+          <w:sz w:val="24"/>
+          <w:szCs w:val="24"/>
+          <w:lang w:eastAsia="tr-TR"/>
+        </w:rPr>
+        <w:t xml:space="preserve"> bileşeni ile kütle ve yerçekimi parametrelerine sahiptir. </w:t>
+      </w:r>
+      <w:r>
+        <w:rPr>
+          <w:rFonts w:ascii="Times New Roman" w:eastAsia="Times New Roman" w:hAnsi="Times New Roman" w:cs="Times New Roman"/>
+          <w:sz w:val="24"/>
+          <w:szCs w:val="24"/>
+          <w:lang w:eastAsia="tr-TR"/>
+        </w:rPr>
+        <w:t>Sistemdeki referans değer olan r(t)</w:t>
+      </w:r>
+      <w:r>
+        <w:rPr>
+          <w:rFonts w:ascii="Times New Roman" w:eastAsia="Times New Roman" w:hAnsi="Times New Roman" w:cs="Times New Roman"/>
+          <w:sz w:val="24"/>
+          <w:szCs w:val="24"/>
+          <w:lang w:eastAsia="tr-TR"/>
+        </w:rPr>
+        <w:t xml:space="preserve">, yol merkezinden geçen sanal </w:t>
+      </w:r>
+      <w:proofErr w:type="spellStart"/>
+      <w:r>
+        <w:rPr>
+          <w:rFonts w:ascii="Times New Roman" w:eastAsia="Times New Roman" w:hAnsi="Times New Roman" w:cs="Times New Roman"/>
+          <w:sz w:val="24"/>
+          <w:szCs w:val="24"/>
+          <w:lang w:eastAsia="tr-TR"/>
+        </w:rPr>
+        <w:t>spline</w:t>
+      </w:r>
+      <w:proofErr w:type="spellEnd"/>
+      <w:r>
+        <w:rPr>
+          <w:rFonts w:ascii="Times New Roman" w:eastAsia="Times New Roman" w:hAnsi="Times New Roman" w:cs="Times New Roman"/>
+          <w:sz w:val="24"/>
+          <w:szCs w:val="24"/>
+          <w:lang w:eastAsia="tr-TR"/>
+        </w:rPr>
+        <w:t xml:space="preserve"> hattıdır. </w:t>
+      </w:r>
+    </w:p>
+    <w:p>
+      <w:pPr>
+        <w:spacing w:after="0" w:line="240" w:lineRule="auto"/>
+        <w:rPr>
+          <w:rFonts w:ascii="Times New Roman" w:eastAsia="Times New Roman" w:hAnsi="Times New Roman" w:cs="Times New Roman"/>
+          <w:sz w:val="24"/>
+          <w:szCs w:val="24"/>
+          <w:lang w:eastAsia="tr-TR"/>
+        </w:rPr>
+      </w:pPr>
+      <w:r>
+        <w:rPr>
+          <w:rFonts w:ascii="Times New Roman" w:eastAsia="Times New Roman" w:hAnsi="Times New Roman" w:cs="Times New Roman"/>
+          <w:sz w:val="24"/>
+          <w:szCs w:val="24"/>
+          <w:lang w:eastAsia="tr-TR"/>
+        </w:rPr>
+        <w:drawing>
+          <wp:inline distT="0" distB="0" distL="0" distR="0" wp14:anchorId="25870A34" wp14:editId="72BD134C">
+            <wp:extent cx="5760720" cy="3168650"/>
+            <wp:effectExtent l="0" t="0" r="0" b="0"/>
+            <wp:docPr id="2" name="Resim 2"/>
+            <wp:cNvGraphicFramePr>
+              <a:graphicFrameLocks xmlns:a="http://schemas.openxmlformats.org/drawingml/2006/main" noChangeAspect="1"/>
+            </wp:cNvGraphicFramePr>
+            <a:graphic xmlns:a="http://schemas.openxmlformats.org/drawingml/2006/main">
+              <a:graphicData uri="http://schemas.openxmlformats.org/drawingml/2006/picture">
+                <pic:pic xmlns:pic="http://schemas.openxmlformats.org/drawingml/2006/picture">
+                  <pic:nvPicPr>
+                    <pic:cNvPr id="1" name=""/>
+                    <pic:cNvPicPr/>
+                  </pic:nvPicPr>
+                  <pic:blipFill>
+                    <a:blip r:embed="rId5"/>
+                    <a:stretch>
+                      <a:fillRect/>
+                    </a:stretch>
+                  </pic:blipFill>
+                  <pic:spPr>
+                    <a:xfrm>
+                      <a:off x="0" y="0"/>
+                      <a:ext cx="5760720" cy="3168650"/>
+                    </a:xfrm>
+                    <a:prstGeom prst="rect">
+                      <a:avLst/>
+                    </a:prstGeom>
+                  </pic:spPr>
+                </pic:pic>
+              </a:graphicData>
+            </a:graphic>
+          </wp:inline>
+        </w:drawing>
+      </w:r>
+      <w:r>
+        <w:rPr>
+          <w:rFonts w:ascii="Times New Roman" w:eastAsia="Times New Roman" w:hAnsi="Times New Roman" w:cs="Times New Roman"/>
+          <w:sz w:val="24"/>
+          <w:szCs w:val="24"/>
+          <w:lang w:eastAsia="tr-TR"/>
+        </w:rPr>
+        <w:t xml:space="preserve">(8 </w:t>
+      </w:r>
+      <w:proofErr w:type="gramStart"/>
+      <w:r>
+        <w:rPr>
+          <w:rFonts w:ascii="Times New Roman" w:eastAsia="Times New Roman" w:hAnsi="Times New Roman" w:cs="Times New Roman"/>
+          <w:sz w:val="24"/>
+          <w:szCs w:val="24"/>
+          <w:lang w:eastAsia="tr-TR"/>
+        </w:rPr>
+        <w:t>virajlı</w:t>
+      </w:r>
+      <w:proofErr w:type="gramEnd"/>
+      <w:r>
+        <w:rPr>
+          <w:rFonts w:ascii="Times New Roman" w:eastAsia="Times New Roman" w:hAnsi="Times New Roman" w:cs="Times New Roman"/>
+          <w:sz w:val="24"/>
+          <w:szCs w:val="24"/>
+          <w:lang w:eastAsia="tr-TR"/>
+        </w:rPr>
+        <w:t xml:space="preserve"> yol)</w:t>
+      </w:r>
+    </w:p>
+    <w:p>
+      <w:pPr>
+        <w:spacing w:after="0" w:line="240" w:lineRule="auto"/>
+        <w:rPr>
+          <w:rFonts w:ascii="Times New Roman" w:eastAsia="Times New Roman" w:hAnsi="Times New Roman" w:cs="Times New Roman"/>
+          <w:sz w:val="24"/>
+          <w:szCs w:val="24"/>
+          <w:lang w:eastAsia="tr-TR"/>
+        </w:rPr>
+      </w:pPr>
+    </w:p>
+    <w:p>
+      <w:pPr>
+        <w:spacing w:after="0" w:line="240" w:lineRule="auto"/>
+        <w:jc w:val="center"/>
+        <w:rPr>
+          <w:rFonts w:ascii="Times New Roman" w:eastAsia="Times New Roman" w:hAnsi="Times New Roman" w:cs="Times New Roman"/>
+          <w:sz w:val="40"/>
+          <w:szCs w:val="40"/>
+          <w:lang w:eastAsia="tr-TR"/>
+        </w:rPr>
+      </w:pPr>
+      <w:r>
+        <w:rPr>
+          <w:rFonts w:ascii="Times New Roman" w:eastAsia="Times New Roman" w:hAnsi="Times New Roman" w:cs="Times New Roman"/>
+          <w:sz w:val="40"/>
+          <w:szCs w:val="40"/>
+          <w:lang w:eastAsia="tr-TR"/>
+        </w:rPr>
+        <w:t>SİSTEMİN MATEMATİKSEL YAPISI</w:t>
+      </w:r>
+    </w:p>
+    <w:p>
+      <w:pPr>
+        <w:rPr>
+          <w:rFonts w:ascii="Times New Roman" w:hAnsi="Times New Roman" w:cs="Times New Roman"/>
+          <w:b/>
+          <w:sz w:val="24"/>
+          <w:szCs w:val="24"/>
+        </w:rPr>
+      </w:pPr>
+    </w:p>
+    <w:p>
+      <w:pPr>
+        <w:rPr>
+          <w:rFonts w:ascii="Times New Roman" w:hAnsi="Times New Roman" w:cs="Times New Roman"/>
+          <w:b/>
+          <w:sz w:val="24"/>
+          <w:szCs w:val="24"/>
+        </w:rPr>
+      </w:pPr>
+      <w:r>
+        <w:rPr>
+          <w:rFonts w:ascii="Times New Roman" w:hAnsi="Times New Roman" w:cs="Times New Roman"/>
+          <w:b/>
+          <w:sz w:val="24"/>
+          <w:szCs w:val="24"/>
+        </w:rPr>
+        <w:t>1. Kinematik Model</w:t>
+      </w:r>
+    </w:p>
+    <w:p>
+      <w:pPr>
+        <w:pStyle w:val="NormalWeb"/>
+      </w:pPr>
+      <w:r>
+        <w:t>Aracın kütlesinin (m) ve uygulanan kuvvetlerin ihmal edildiği, salt geometrik konum değişimini ifade eden modeldir. Aracın hızı V ve yönelim açısı θ olmak üzere sistemin durum denklemleri şu şekildedir:</w:t>
+      </w:r>
+    </w:p>
+    <w:p>
+      <w:pPr>
+        <w:pStyle w:val="NormalWeb"/>
+      </w:pPr>
+      <w:proofErr w:type="gramStart"/>
+      <w:r>
+        <w:t>x</w:t>
+      </w:r>
+      <w:proofErr w:type="gramEnd"/>
+      <w:r>
+        <w:t>̇ = V cos(θ)</w:t>
+      </w:r>
+    </w:p>
+    <w:p>
+      <w:pPr>
+        <w:pStyle w:val="NormalWeb"/>
+      </w:pPr>
+      <w:proofErr w:type="gramStart"/>
+      <w:r>
+        <w:t>z</w:t>
+      </w:r>
+      <w:proofErr w:type="gramEnd"/>
+      <w:r>
+        <w:t>̇ = V sin(θ)</w:t>
+      </w:r>
+    </w:p>
+    <w:p>
+      <w:pPr>
+        <w:pStyle w:val="NormalWeb"/>
+      </w:pPr>
+      <w:r>
+        <w:t>θ̇ = ω</w:t>
+      </w:r>
+    </w:p>
+    <w:p>
+      <w:pPr>
+        <w:pStyle w:val="NormalWeb"/>
+      </w:pPr>
+      <w:r>
+        <w:t xml:space="preserve">Bu modelde kontrolcü doğrudan </w:t>
+      </w:r>
+      <w:proofErr w:type="spellStart"/>
+      <w:r>
+        <w:t>açısal</w:t>
+      </w:r>
+      <w:proofErr w:type="spellEnd"/>
+      <w:r>
+        <w:t xml:space="preserve"> hızı (ω) kontrol ettiği için aracın kütlesi sistemin davranışını etkilememektedir.</w:t>
+      </w:r>
+    </w:p>
+    <w:p>
+      <w:pPr>
+        <w:rPr>
+          <w:rFonts w:ascii="Times New Roman" w:hAnsi="Times New Roman" w:cs="Times New Roman"/>
+          <w:b/>
+          <w:sz w:val="24"/>
+          <w:szCs w:val="24"/>
+        </w:rPr>
+      </w:pPr>
+    </w:p>
+    <w:p>
+      <w:pPr>
+        <w:rPr>
+          <w:rFonts w:ascii="Times New Roman" w:hAnsi="Times New Roman" w:cs="Times New Roman"/>
+          <w:b/>
+          <w:sz w:val="24"/>
+          <w:szCs w:val="24"/>
+        </w:rPr>
+      </w:pPr>
+      <w:r>
+        <w:rPr>
+          <w:rFonts w:ascii="Times New Roman" w:hAnsi="Times New Roman" w:cs="Times New Roman"/>
+          <w:b/>
+          <w:sz w:val="24"/>
+          <w:szCs w:val="24"/>
+        </w:rPr>
+        <w:t>2. Dinamik Model (Mevcut Sistem)</w:t>
+      </w:r>
+    </w:p>
+    <w:p>
+      <w:pPr>
+        <w:pStyle w:val="NormalWeb"/>
+      </w:pPr>
+      <w:proofErr w:type="spellStart"/>
+      <w:r>
+        <w:t>Unity’nin</w:t>
+      </w:r>
+      <w:proofErr w:type="spellEnd"/>
+      <w:r>
+        <w:t xml:space="preserve"> fizik motoru (</w:t>
+      </w:r>
+      <w:proofErr w:type="spellStart"/>
+      <w:r>
+        <w:t>Rigidbody</w:t>
+      </w:r>
+      <w:proofErr w:type="spellEnd"/>
+      <w:r>
+        <w:t>) aktif edilerek (</w:t>
+      </w:r>
+      <w:proofErr w:type="spellStart"/>
+      <w:r>
+        <w:t>IsKinematic</w:t>
+      </w:r>
+      <w:proofErr w:type="spellEnd"/>
+      <w:r>
+        <w:t xml:space="preserve"> = </w:t>
+      </w:r>
+      <w:proofErr w:type="spellStart"/>
+      <w:r>
+        <w:t>False</w:t>
+      </w:r>
+      <w:proofErr w:type="spellEnd"/>
+      <w:r>
+        <w:t xml:space="preserve">) aracın kütlesi (m) ve kütle atalet momenti (J) denkleme </w:t>
+      </w:r>
+      <w:proofErr w:type="gramStart"/>
+      <w:r>
+        <w:t>dahil</w:t>
+      </w:r>
+      <w:proofErr w:type="gramEnd"/>
+      <w:r>
+        <w:t xml:space="preserve"> edilmiştir. Bu modelde PID kontrolcüsü araca doğrudan açı vermek yerine, Y ekseni etrafında bir dönme momenti (</w:t>
+      </w:r>
+      <w:proofErr w:type="spellStart"/>
+      <w:r>
+        <w:t>Torque</w:t>
+      </w:r>
+      <w:proofErr w:type="spellEnd"/>
+      <w:r>
+        <w:t xml:space="preserve">, τ) uygulamaktadır. Sistemin </w:t>
+      </w:r>
+      <w:proofErr w:type="spellStart"/>
+      <w:r>
+        <w:t>rotasyonel</w:t>
+      </w:r>
+      <w:proofErr w:type="spellEnd"/>
+      <w:r>
+        <w:t xml:space="preserve"> dinamiği Newton’un 2. Hareket Yasası’na göre şu şekildedir:</w:t>
+      </w:r>
+    </w:p>
+    <w:p>
+      <w:pPr>
+        <w:pStyle w:val="NormalWeb"/>
+      </w:pPr>
+      <w:r>
+        <w:t xml:space="preserve">τ = </w:t>
+      </w:r>
+      <w:proofErr w:type="spellStart"/>
+      <w:r>
+        <w:t>Jθ</w:t>
+      </w:r>
+      <w:proofErr w:type="spellEnd"/>
+      <w:r>
+        <w:t xml:space="preserve">̈ + </w:t>
+      </w:r>
+      <w:proofErr w:type="spellStart"/>
+      <w:r>
+        <w:t>bθ</w:t>
+      </w:r>
+      <w:proofErr w:type="spellEnd"/>
+      <w:r>
+        <w:t>̇</w:t>
+      </w:r>
+    </w:p>
+    <w:p>
+      <w:pPr>
+        <w:pStyle w:val="NormalWeb"/>
+      </w:pPr>
+      <w:r>
+        <w:t xml:space="preserve">Bu denklemde J kütle atalet momentini, θ̈ </w:t>
+      </w:r>
+      <w:proofErr w:type="spellStart"/>
+      <w:r>
+        <w:t>açısal</w:t>
+      </w:r>
+      <w:proofErr w:type="spellEnd"/>
+      <w:r>
+        <w:t xml:space="preserve"> ivmeyi ve b sönümleme/sürtünme katsayısını temsil etmektedir. Dinamik modelde J değeri kütleye doğrudan bağlı olduğu için:</w:t>
+      </w:r>
+    </w:p>
+    <w:p>
+      <w:pPr>
+        <w:pStyle w:val="NormalWeb"/>
+      </w:pPr>
+      <w:r>
+        <w:t>J = ∫ r² dm</w:t>
+      </w:r>
+    </w:p>
+    <w:p>
+      <w:pPr>
+        <w:pStyle w:val="NormalWeb"/>
+      </w:pPr>
+      <w:proofErr w:type="gramStart"/>
+      <w:r>
+        <w:t>araç</w:t>
+      </w:r>
+      <w:proofErr w:type="gramEnd"/>
+      <w:r>
+        <w:t xml:space="preserve"> kütlesi değiştiğinde aynı </w:t>
+      </w:r>
+      <w:proofErr w:type="spellStart"/>
+      <w:r>
+        <w:t>yönlendiriyi</w:t>
+      </w:r>
+      <w:proofErr w:type="spellEnd"/>
+      <w:r>
+        <w:t xml:space="preserve"> izleyebilmek için kontrolcünün üretmesi gereken τ (</w:t>
+      </w:r>
+      <w:proofErr w:type="spellStart"/>
+      <w:r>
+        <w:t>Tork</w:t>
+      </w:r>
+      <w:proofErr w:type="spellEnd"/>
+      <w:r>
+        <w:t>) miktarı da değişmek zorundadır.</w:t>
+      </w:r>
+    </w:p>
+    <w:p>
+      <w:pPr>
+        <w:spacing w:before="100" w:beforeAutospacing="1" w:after="100" w:afterAutospacing="1" w:line="240" w:lineRule="auto"/>
+        <w:rPr>
+          <w:rFonts w:ascii="Times New Roman" w:eastAsia="Times New Roman" w:hAnsi="Times New Roman" w:cs="Times New Roman"/>
+          <w:sz w:val="24"/>
+          <w:szCs w:val="24"/>
+          <w:lang w:eastAsia="tr-TR"/>
+        </w:rPr>
       </w:pPr>
     </w:p>
     <w:p>
@@ -215,195 +833,18 @@
           <w:lang w:eastAsia="tr-TR"/>
         </w:rPr>
       </w:pPr>
-      <w:r>
+    </w:p>
+    <w:p>
+      <w:pPr>
+        <w:spacing w:before="100" w:beforeAutospacing="1" w:after="100" w:afterAutospacing="1" w:line="240" w:lineRule="auto"/>
+        <w:jc w:val="center"/>
         <w:rPr>
           <w:rFonts w:ascii="Times New Roman" w:eastAsia="Times New Roman" w:hAnsi="Times New Roman" w:cs="Times New Roman"/>
           <w:sz w:val="40"/>
           <w:szCs w:val="40"/>
           <w:lang w:eastAsia="tr-TR"/>
         </w:rPr>
-        <w:t>SİSTEM VE YOL TANIMI</w:t>
-      </w:r>
-    </w:p>
-    <w:p>
-      <w:pPr>
-        <w:spacing w:after="0" w:line="240" w:lineRule="auto"/>
-        <w:rPr>
-          <w:rFonts w:ascii="Times New Roman" w:eastAsia="Times New Roman" w:hAnsi="Times New Roman" w:cs="Times New Roman"/>
-          <w:sz w:val="24"/>
-          <w:szCs w:val="24"/>
-          <w:lang w:eastAsia="tr-TR"/>
-        </w:rPr>
-      </w:pPr>
-      <w:r>
-        <w:rPr>
-          <w:rFonts w:ascii="Times New Roman" w:eastAsia="Times New Roman" w:hAnsi="Times New Roman" w:cs="Times New Roman"/>
-          <w:sz w:val="24"/>
-          <w:szCs w:val="24"/>
-          <w:lang w:eastAsia="tr-TR"/>
-        </w:rPr>
-        <w:t xml:space="preserve">Simülasyon, </w:t>
-      </w:r>
-      <w:proofErr w:type="spellStart"/>
-      <w:r>
-        <w:rPr>
-          <w:rFonts w:ascii="Times New Roman" w:eastAsia="Times New Roman" w:hAnsi="Times New Roman" w:cs="Times New Roman"/>
-          <w:sz w:val="24"/>
-          <w:szCs w:val="24"/>
-          <w:lang w:eastAsia="tr-TR"/>
-        </w:rPr>
-        <w:t>Unity</w:t>
-      </w:r>
-      <w:proofErr w:type="spellEnd"/>
-      <w:r>
-        <w:rPr>
-          <w:rFonts w:ascii="Times New Roman" w:eastAsia="Times New Roman" w:hAnsi="Times New Roman" w:cs="Times New Roman"/>
-          <w:sz w:val="24"/>
-          <w:szCs w:val="24"/>
-          <w:lang w:eastAsia="tr-TR"/>
-        </w:rPr>
-        <w:t xml:space="preserve"> 6 oyun motoru kullanılarak tasarlanmıştır. Yol modeli, </w:t>
-      </w:r>
-      <w:proofErr w:type="spellStart"/>
-      <w:r>
-        <w:rPr>
-          <w:rFonts w:ascii="Times New Roman" w:eastAsia="Times New Roman" w:hAnsi="Times New Roman" w:cs="Times New Roman"/>
-          <w:sz w:val="24"/>
-          <w:szCs w:val="24"/>
-          <w:lang w:eastAsia="tr-TR"/>
-        </w:rPr>
-        <w:t>Unity</w:t>
-      </w:r>
-      <w:proofErr w:type="spellEnd"/>
-      <w:r>
-        <w:rPr>
-          <w:rFonts w:ascii="Times New Roman" w:eastAsia="Times New Roman" w:hAnsi="Times New Roman" w:cs="Times New Roman"/>
-          <w:sz w:val="24"/>
-          <w:szCs w:val="24"/>
-          <w:lang w:eastAsia="tr-TR"/>
-        </w:rPr>
-        <w:t xml:space="preserve"> </w:t>
-      </w:r>
-      <w:proofErr w:type="spellStart"/>
-      <w:r>
-        <w:rPr>
-          <w:rFonts w:ascii="Times New Roman" w:eastAsia="Times New Roman" w:hAnsi="Times New Roman" w:cs="Times New Roman"/>
-          <w:sz w:val="24"/>
-          <w:szCs w:val="24"/>
-          <w:lang w:eastAsia="tr-TR"/>
-        </w:rPr>
-        <w:t>Splines</w:t>
-      </w:r>
-      <w:proofErr w:type="spellEnd"/>
-      <w:r>
-        <w:rPr>
-          <w:rFonts w:ascii="Times New Roman" w:eastAsia="Times New Roman" w:hAnsi="Times New Roman" w:cs="Times New Roman"/>
-          <w:sz w:val="24"/>
-          <w:szCs w:val="24"/>
-          <w:lang w:eastAsia="tr-TR"/>
-        </w:rPr>
-        <w:t xml:space="preserve"> paketi yardımıyla oluşturulmuş ve fiziksel zemin etkileşimi için sisteme Mesh </w:t>
-      </w:r>
-      <w:proofErr w:type="spellStart"/>
-      <w:r>
-        <w:rPr>
-          <w:rFonts w:ascii="Times New Roman" w:eastAsia="Times New Roman" w:hAnsi="Times New Roman" w:cs="Times New Roman"/>
-          <w:sz w:val="24"/>
-          <w:szCs w:val="24"/>
-          <w:lang w:eastAsia="tr-TR"/>
-        </w:rPr>
-        <w:t>Collider</w:t>
-      </w:r>
-      <w:proofErr w:type="spellEnd"/>
-      <w:r>
-        <w:rPr>
-          <w:rFonts w:ascii="Times New Roman" w:eastAsia="Times New Roman" w:hAnsi="Times New Roman" w:cs="Times New Roman"/>
-          <w:sz w:val="24"/>
-          <w:szCs w:val="24"/>
-          <w:lang w:eastAsia="tr-TR"/>
-        </w:rPr>
-        <w:t xml:space="preserve"> </w:t>
-      </w:r>
-      <w:proofErr w:type="gramStart"/>
-      <w:r>
-        <w:rPr>
-          <w:rFonts w:ascii="Times New Roman" w:eastAsia="Times New Roman" w:hAnsi="Times New Roman" w:cs="Times New Roman"/>
-          <w:sz w:val="24"/>
-          <w:szCs w:val="24"/>
-          <w:lang w:eastAsia="tr-TR"/>
-        </w:rPr>
-        <w:t>entegre</w:t>
-      </w:r>
-      <w:proofErr w:type="gramEnd"/>
-      <w:r>
-        <w:rPr>
-          <w:rFonts w:ascii="Times New Roman" w:eastAsia="Times New Roman" w:hAnsi="Times New Roman" w:cs="Times New Roman"/>
-          <w:sz w:val="24"/>
-          <w:szCs w:val="24"/>
-          <w:lang w:eastAsia="tr-TR"/>
-        </w:rPr>
-        <w:t xml:space="preserve"> edilmiştir. Rota, aracın eylemsizlik ve merkezkaç kuvvetlerine karşı kontrolcü performansının test edilebilmesi amacıyla hem düzlükler hem de hafif/keskin </w:t>
-      </w:r>
-      <w:proofErr w:type="gramStart"/>
-      <w:r>
-        <w:rPr>
-          <w:rFonts w:ascii="Times New Roman" w:eastAsia="Times New Roman" w:hAnsi="Times New Roman" w:cs="Times New Roman"/>
-          <w:sz w:val="24"/>
-          <w:szCs w:val="24"/>
-          <w:lang w:eastAsia="tr-TR"/>
-        </w:rPr>
-        <w:t>virajlar</w:t>
-      </w:r>
-      <w:proofErr w:type="gramEnd"/>
-      <w:r>
-        <w:rPr>
-          <w:rFonts w:ascii="Times New Roman" w:eastAsia="Times New Roman" w:hAnsi="Times New Roman" w:cs="Times New Roman"/>
-          <w:sz w:val="24"/>
-          <w:szCs w:val="24"/>
-          <w:lang w:eastAsia="tr-TR"/>
-        </w:rPr>
-        <w:t xml:space="preserve"> içerecek şekilde parametrik olarak bükülmüştür. Simülasyondaki araç, bir </w:t>
-      </w:r>
-      <w:proofErr w:type="spellStart"/>
-      <w:r>
-        <w:rPr>
-          <w:rFonts w:ascii="Times New Roman" w:eastAsia="Times New Roman" w:hAnsi="Times New Roman" w:cs="Times New Roman"/>
-          <w:sz w:val="24"/>
-          <w:szCs w:val="24"/>
-          <w:lang w:eastAsia="tr-TR"/>
-        </w:rPr>
-        <w:t>Rigidbody</w:t>
-      </w:r>
-      <w:proofErr w:type="spellEnd"/>
-      <w:r>
-        <w:rPr>
-          <w:rFonts w:ascii="Times New Roman" w:eastAsia="Times New Roman" w:hAnsi="Times New Roman" w:cs="Times New Roman"/>
-          <w:sz w:val="24"/>
-          <w:szCs w:val="24"/>
-          <w:lang w:eastAsia="tr-TR"/>
-        </w:rPr>
-        <w:t xml:space="preserve"> bileşeni ile kütle ve yerçekimi parametrelerine sahiptir. Sistemdeki referans değer olan $r(t)$, yol merkezinden geçen sanal </w:t>
-      </w:r>
-      <w:proofErr w:type="spellStart"/>
-      <w:r>
-        <w:rPr>
-          <w:rFonts w:ascii="Times New Roman" w:eastAsia="Times New Roman" w:hAnsi="Times New Roman" w:cs="Times New Roman"/>
-          <w:sz w:val="24"/>
-          <w:szCs w:val="24"/>
-          <w:lang w:eastAsia="tr-TR"/>
-        </w:rPr>
-        <w:t>spline</w:t>
-      </w:r>
-      <w:proofErr w:type="spellEnd"/>
-      <w:r>
-        <w:rPr>
-          <w:rFonts w:ascii="Times New Roman" w:eastAsia="Times New Roman" w:hAnsi="Times New Roman" w:cs="Times New Roman"/>
-          <w:sz w:val="24"/>
-          <w:szCs w:val="24"/>
-          <w:lang w:eastAsia="tr-TR"/>
-        </w:rPr>
-        <w:t xml:space="preserve"> hattıdır. </w:t>
-      </w:r>
+      </w:pPr>
     </w:p>
     <w:p>
       <w:pPr>
@@ -428,183 +869,189 @@
           <w:lang w:eastAsia="tr-TR"/>
         </w:rPr>
       </w:pPr>
-      <w:r>
+    </w:p>
+    <w:p>
+      <w:pPr>
+        <w:spacing w:before="100" w:beforeAutospacing="1" w:after="100" w:afterAutospacing="1" w:line="240" w:lineRule="auto"/>
+        <w:jc w:val="center"/>
         <w:rPr>
           <w:rFonts w:ascii="Times New Roman" w:eastAsia="Times New Roman" w:hAnsi="Times New Roman" w:cs="Times New Roman"/>
           <w:sz w:val="40"/>
           <w:szCs w:val="40"/>
           <w:lang w:eastAsia="tr-TR"/>
         </w:rPr>
-        <w:t>HATA VE KONTROLCÜ YAPISI</w:t>
-      </w:r>
-    </w:p>
-    <w:p>
-      <w:pPr>
-        <w:pStyle w:val="NormalWeb"/>
-      </w:pPr>
-      <w:r>
-        <w:t>Sistemde aracın referans yolun merkez hattına göre ölçülen yanal sapma miktarı, hata sinyali olan e(t) değerini oluşturmaktadır. Bu değer, aracın dünya (</w:t>
-      </w:r>
-      <w:proofErr w:type="spellStart"/>
-      <w:r>
-        <w:t>world</w:t>
-      </w:r>
-      <w:proofErr w:type="spellEnd"/>
-      <w:r>
-        <w:t xml:space="preserve">) koordinatlarındaki konumunun, </w:t>
-      </w:r>
-      <w:proofErr w:type="spellStart"/>
-      <w:r>
-        <w:t>spline</w:t>
-      </w:r>
-      <w:proofErr w:type="spellEnd"/>
-      <w:r>
-        <w:t xml:space="preserve"> üzerindeki en yakın noktaya (y(t)) olan dik uzaklığının </w:t>
-      </w:r>
-      <w:proofErr w:type="spellStart"/>
-      <w:r>
-        <w:t>vektörel</w:t>
-      </w:r>
-      <w:proofErr w:type="spellEnd"/>
-      <w:r>
-        <w:t xml:space="preserve"> izdüşümü ile hesaplanmaktadır.</w:t>
-      </w:r>
-    </w:p>
-    <w:p>
-      <w:pPr>
-        <w:pStyle w:val="NormalWeb"/>
-      </w:pPr>
-      <w:r>
-        <w:rPr>
-          <w:rStyle w:val="Gl"/>
-        </w:rPr>
-        <w:t>e(t) = r(t) - y(t)</w:t>
-      </w:r>
-    </w:p>
-    <w:p>
-      <w:pPr>
-        <w:pStyle w:val="NormalWeb"/>
-      </w:pPr>
-      <w:r>
-        <w:t>Sistemi şeritte tutmak için uygulanan denetleyici, PID (</w:t>
-      </w:r>
-      <w:proofErr w:type="spellStart"/>
-      <w:r>
-        <w:t>Proportional-Integral-Derivative</w:t>
-      </w:r>
-      <w:proofErr w:type="spellEnd"/>
-      <w:r>
-        <w:t>) mimarisindedir. Denetleyici çıkışı olan kontrol sinyali u(t), aşağıdaki denklemle hesaplanmaktadır:</w:t>
-      </w:r>
-    </w:p>
-    <w:p>
-      <w:pPr>
-        <w:pStyle w:val="NormalWeb"/>
-      </w:pPr>
-      <w:r>
-        <w:rPr>
-          <w:rStyle w:val="Gl"/>
-        </w:rPr>
-        <w:t xml:space="preserve">u(t) = </w:t>
-      </w:r>
-      <w:proofErr w:type="spellStart"/>
-      <w:r>
-        <w:rPr>
-          <w:rStyle w:val="Gl"/>
-        </w:rPr>
-        <w:t>Kp·e</w:t>
-      </w:r>
-      <w:proofErr w:type="spellEnd"/>
-      <w:r>
-        <w:rPr>
-          <w:rStyle w:val="Gl"/>
-        </w:rPr>
-        <w:t>(t) + Ki·∫e(t)</w:t>
-      </w:r>
-      <w:proofErr w:type="spellStart"/>
-      <w:r>
-        <w:rPr>
-          <w:rStyle w:val="Gl"/>
-        </w:rPr>
-        <w:t>dt</w:t>
-      </w:r>
-      <w:proofErr w:type="spellEnd"/>
-      <w:r>
-        <w:rPr>
-          <w:rStyle w:val="Gl"/>
-        </w:rPr>
-        <w:t xml:space="preserve"> + </w:t>
-      </w:r>
-      <w:proofErr w:type="spellStart"/>
-      <w:r>
-        <w:rPr>
-          <w:rStyle w:val="Gl"/>
-        </w:rPr>
-        <w:t>Kd</w:t>
-      </w:r>
-      <w:proofErr w:type="spellEnd"/>
-      <w:r>
-        <w:rPr>
-          <w:rStyle w:val="Gl"/>
-        </w:rPr>
-        <w:t>·(de(t)/</w:t>
-      </w:r>
-      <w:proofErr w:type="spellStart"/>
-      <w:r>
-        <w:rPr>
-          <w:rStyle w:val="Gl"/>
-        </w:rPr>
-        <w:t>dt</w:t>
-      </w:r>
-      <w:proofErr w:type="spellEnd"/>
-      <w:r>
-        <w:rPr>
-          <w:rStyle w:val="Gl"/>
-        </w:rPr>
-        <w:t>)</w:t>
-      </w:r>
-    </w:p>
-    <w:p>
-      <w:pPr>
-        <w:pStyle w:val="NormalWeb"/>
-      </w:pPr>
-      <w:r>
-        <w:lastRenderedPageBreak/>
-        <w:t>Hesaplanan bu u(t) kontrol sinyali, araca yönlendirme (</w:t>
-      </w:r>
-      <w:proofErr w:type="spellStart"/>
-      <w:r>
-        <w:t>steering</w:t>
-      </w:r>
-      <w:proofErr w:type="spellEnd"/>
-      <w:r>
-        <w:t>) girdisi olarak verilmekte ve aracı referans merkeze yaklaştırmak için Y ekseni etrafında dönüş kuvveti uygulamaktadır.</w:t>
-      </w:r>
-    </w:p>
-    <w:p>
-      <w:pPr>
-        <w:pStyle w:val="NormalWeb"/>
-      </w:pPr>
-      <w:r>
-        <w:t>Gerçek dünya fiziksel sınırlarını yansıtmak amacıyla, kontrol sinyali yazılım içerisinde ±1 (tam sağ / tam sol) doyum (</w:t>
-      </w:r>
-      <w:proofErr w:type="spellStart"/>
-      <w:r>
-        <w:t>saturation</w:t>
-      </w:r>
-      <w:proofErr w:type="spellEnd"/>
-      <w:r>
-        <w:t>) limitlerine tabi tutulmuştur.</w:t>
-      </w:r>
-    </w:p>
-    <w:p>
-      <w:pPr>
-        <w:pStyle w:val="NormalWeb"/>
-        <w:jc w:val="center"/>
-        <w:rPr>
+      </w:pPr>
+      <w:r>
+        <w:rPr>
+          <w:rFonts w:ascii="Times New Roman" w:eastAsia="Times New Roman" w:hAnsi="Times New Roman" w:cs="Times New Roman"/>
           <w:sz w:val="40"/>
           <w:szCs w:val="40"/>
-        </w:rPr>
+          <w:lang w:eastAsia="tr-TR"/>
+        </w:rPr>
+        <w:t>HATA VE KONTROLCÜ YAPISI</w:t>
+      </w:r>
+    </w:p>
+    <w:p>
+      <w:pPr>
+        <w:pStyle w:val="NormalWeb"/>
+      </w:pPr>
+      <w:r>
+        <w:t>Sistemde aracın referans yolun merkez hattına göre ölçülen yanal sapma miktarı, hata sinyali olan e(t) değerini oluşturmaktadır. Bu değer, aracın dünya (</w:t>
+      </w:r>
+      <w:proofErr w:type="spellStart"/>
+      <w:r>
+        <w:t>world</w:t>
+      </w:r>
+      <w:proofErr w:type="spellEnd"/>
+      <w:r>
+        <w:t xml:space="preserve">) koordinatlarındaki konumunun, </w:t>
+      </w:r>
+      <w:proofErr w:type="spellStart"/>
+      <w:r>
+        <w:t>spline</w:t>
+      </w:r>
+      <w:proofErr w:type="spellEnd"/>
+      <w:r>
+        <w:t xml:space="preserve"> üzerindeki en yakın noktaya (y(t)) olan dik uzaklığının </w:t>
+      </w:r>
+      <w:proofErr w:type="spellStart"/>
+      <w:r>
+        <w:t>vektörel</w:t>
+      </w:r>
+      <w:proofErr w:type="spellEnd"/>
+      <w:r>
+        <w:t xml:space="preserve"> izdüşümü ile hesaplanmaktadır.</w:t>
+      </w:r>
+    </w:p>
+    <w:p>
+      <w:pPr>
+        <w:pStyle w:val="NormalWeb"/>
+      </w:pPr>
+      <w:r>
+        <w:rPr>
+          <w:rStyle w:val="Gl"/>
+        </w:rPr>
+        <w:t>e(t) = r(t) - y(t)</w:t>
+      </w:r>
+    </w:p>
+    <w:p>
+      <w:pPr>
+        <w:pStyle w:val="NormalWeb"/>
+      </w:pPr>
+      <w:r>
+        <w:t>Sistemi şeritte tutmak için uygulanan denetleyici, PID (</w:t>
+      </w:r>
+      <w:proofErr w:type="spellStart"/>
+      <w:r>
+        <w:t>Proportional-Integral-Derivative</w:t>
+      </w:r>
+      <w:proofErr w:type="spellEnd"/>
+      <w:r>
+        <w:t>) mimarisindedir. Denetleyici çıkışı olan kontrol sinyali u(t), aşağıdaki denklemle hesaplanmaktadır:</w:t>
+      </w:r>
+    </w:p>
+    <w:p>
+      <w:pPr>
+        <w:pStyle w:val="NormalWeb"/>
+      </w:pPr>
+      <w:r>
+        <w:rPr>
+          <w:rStyle w:val="Gl"/>
+        </w:rPr>
+        <w:t xml:space="preserve">u(t) = </w:t>
+      </w:r>
+      <w:proofErr w:type="spellStart"/>
+      <w:r>
+        <w:rPr>
+          <w:rStyle w:val="Gl"/>
+        </w:rPr>
+        <w:t>Kp·e</w:t>
+      </w:r>
+      <w:proofErr w:type="spellEnd"/>
+      <w:r>
+        <w:rPr>
+          <w:rStyle w:val="Gl"/>
+        </w:rPr>
+        <w:t>(t) + Ki·∫e(t)</w:t>
+      </w:r>
+      <w:proofErr w:type="spellStart"/>
+      <w:r>
+        <w:rPr>
+          <w:rStyle w:val="Gl"/>
+        </w:rPr>
+        <w:t>dt</w:t>
+      </w:r>
+      <w:proofErr w:type="spellEnd"/>
+      <w:r>
+        <w:rPr>
+          <w:rStyle w:val="Gl"/>
+        </w:rPr>
+        <w:t xml:space="preserve"> + </w:t>
+      </w:r>
+      <w:proofErr w:type="spellStart"/>
+      <w:r>
+        <w:rPr>
+          <w:rStyle w:val="Gl"/>
+        </w:rPr>
+        <w:t>Kd</w:t>
+      </w:r>
+      <w:proofErr w:type="spellEnd"/>
+      <w:r>
+        <w:rPr>
+          <w:rStyle w:val="Gl"/>
+        </w:rPr>
+        <w:t>·(de(t)/</w:t>
+      </w:r>
+      <w:proofErr w:type="spellStart"/>
+      <w:r>
+        <w:rPr>
+          <w:rStyle w:val="Gl"/>
+        </w:rPr>
+        <w:t>dt</w:t>
+      </w:r>
+      <w:proofErr w:type="spellEnd"/>
+      <w:r>
+        <w:rPr>
+          <w:rStyle w:val="Gl"/>
+        </w:rPr>
+        <w:t>)</w:t>
+      </w:r>
+    </w:p>
+    <w:p>
+      <w:pPr>
+        <w:pStyle w:val="NormalWeb"/>
+      </w:pPr>
+      <w:r>
+        <w:t>Hesaplanan bu u(t) kontrol sinyali, araca yönlendirme (</w:t>
+      </w:r>
+      <w:proofErr w:type="spellStart"/>
+      <w:r>
+        <w:t>steering</w:t>
+      </w:r>
+      <w:proofErr w:type="spellEnd"/>
+      <w:r>
+        <w:t>) girdisi olarak verilmekte ve aracı referans merkeze yaklaştırmak için Y ekseni etrafında dönüş kuvveti uygulamaktadır.</w:t>
+      </w:r>
+    </w:p>
+    <w:p>
+      <w:pPr>
+        <w:pStyle w:val="NormalWeb"/>
+      </w:pPr>
+      <w:r>
+        <w:t>Gerçek dünya fiziksel sınırlarını yansıtmak amacıyla, kontrol sinyali yazılım içerisinde ±1 (tam sağ / tam sol) doyum (</w:t>
+      </w:r>
+      <w:proofErr w:type="spellStart"/>
+      <w:r>
+        <w:t>saturation</w:t>
+      </w:r>
+      <w:proofErr w:type="spellEnd"/>
+      <w:r>
+        <w:t>) limitlerine tabi tutulmuştur.</w:t>
+      </w:r>
+    </w:p>
+    <w:p>
+      <w:pPr>
+        <w:pStyle w:val="NormalWeb"/>
       </w:pPr>
     </w:p>
     <w:p>
@@ -778,19 +1225,6 @@
       <w:r>
         <w:t xml:space="preserve"> = 0.1</w:t>
       </w:r>
-      <w:r>
-        <w:br/>
-        <w:t>(Not: Gerekirse kendi bulduğun en iyi değerleri buraya yazabilirsin.)</w:t>
-      </w:r>
-    </w:p>
-    <w:p>
-      <w:pPr>
-        <w:pStyle w:val="NormalWeb"/>
-        <w:rPr>
-          <w:sz w:val="22"/>
-          <w:szCs w:val="22"/>
-        </w:rPr>
-      </w:pPr>
     </w:p>
     <w:p>
       <w:pPr>
@@ -801,122 +1235,16 @@
           <w:szCs w:val="40"/>
         </w:rPr>
       </w:pPr>
-      <w:r>
+    </w:p>
+    <w:p>
+      <w:pPr>
+        <w:pStyle w:val="NormalWeb"/>
+        <w:jc w:val="center"/>
         <w:rPr>
           <w:sz w:val="40"/>
           <w:szCs w:val="40"/>
         </w:rPr>
-        <w:t>GRAFİKLER</w:t>
-      </w:r>
-    </w:p>
-    <w:p>
-      <w:pPr>
-        <w:spacing w:before="100" w:beforeAutospacing="1" w:after="100" w:afterAutospacing="1" w:line="240" w:lineRule="auto"/>
-        <w:rPr>
-          <w:rFonts w:ascii="Times New Roman" w:eastAsia="Times New Roman" w:hAnsi="Times New Roman" w:cs="Times New Roman"/>
-          <w:sz w:val="24"/>
-          <w:szCs w:val="24"/>
-          <w:lang w:eastAsia="tr-TR"/>
-        </w:rPr>
-      </w:pPr>
-      <w:r>
-        <w:rPr>
-          <w:rFonts w:ascii="Times New Roman" w:eastAsia="Times New Roman" w:hAnsi="Times New Roman" w:cs="Times New Roman"/>
-          <w:i/>
-          <w:iCs/>
-          <w:sz w:val="24"/>
-          <w:szCs w:val="24"/>
-          <w:lang w:eastAsia="tr-TR"/>
-        </w:rPr>
-        <w:t>(Bu bölüme Excel'den çıkardığın grafikleri ekran görüntüsü alarak eklemelisin. Her grafiğin altına şu açıklamaları yazabilirsin:)</w:t>
-      </w:r>
-    </w:p>
-    <w:p>
-      <w:pPr>
-        <w:numPr>
-          <w:ilvl w:val="0"/>
-          <w:numId w:val="1"/>
-        </w:numPr>
-        <w:spacing w:before="100" w:beforeAutospacing="1" w:after="100" w:afterAutospacing="1" w:line="240" w:lineRule="auto"/>
-        <w:rPr>
-          <w:rFonts w:ascii="Times New Roman" w:eastAsia="Times New Roman" w:hAnsi="Times New Roman" w:cs="Times New Roman"/>
-          <w:sz w:val="24"/>
-          <w:szCs w:val="24"/>
-          <w:lang w:eastAsia="tr-TR"/>
-        </w:rPr>
-      </w:pPr>
-      <w:r>
-        <w:rPr>
-          <w:rFonts w:ascii="Times New Roman" w:eastAsia="Times New Roman" w:hAnsi="Times New Roman" w:cs="Times New Roman"/>
-          <w:b/>
-          <w:bCs/>
-          <w:sz w:val="24"/>
-          <w:szCs w:val="24"/>
-          <w:lang w:eastAsia="tr-TR"/>
-        </w:rPr>
-        <w:t>Grafik 1: Referans ve Gerçek İzlenen Yol Karşılaştırması</w:t>
-      </w:r>
-      <w:r>
-        <w:rPr>
-          <w:rFonts w:ascii="Times New Roman" w:eastAsia="Times New Roman" w:hAnsi="Times New Roman" w:cs="Times New Roman"/>
-          <w:sz w:val="24"/>
-          <w:szCs w:val="24"/>
-          <w:lang w:eastAsia="tr-TR"/>
-        </w:rPr>
-        <w:t xml:space="preserve"> (Arabanın X ve Z koordinatları ile yolun X ve Z koordinatlarını üst üste çizdir.)</w:t>
-      </w:r>
-    </w:p>
-    <w:p>
-      <w:pPr>
-        <w:numPr>
-          <w:ilvl w:val="0"/>
-          <w:numId w:val="1"/>
-        </w:numPr>
-        <w:spacing w:before="100" w:beforeAutospacing="1" w:after="100" w:afterAutospacing="1" w:line="240" w:lineRule="auto"/>
-        <w:rPr>
-          <w:rFonts w:ascii="Times New Roman" w:eastAsia="Times New Roman" w:hAnsi="Times New Roman" w:cs="Times New Roman"/>
-          <w:sz w:val="24"/>
-          <w:szCs w:val="24"/>
-          <w:lang w:eastAsia="tr-TR"/>
-        </w:rPr>
-      </w:pPr>
-      <w:r>
-        <w:rPr>
-          <w:rFonts w:ascii="Times New Roman" w:eastAsia="Times New Roman" w:hAnsi="Times New Roman" w:cs="Times New Roman"/>
-          <w:b/>
-          <w:bCs/>
-          <w:sz w:val="24"/>
-          <w:szCs w:val="24"/>
-          <w:lang w:eastAsia="tr-TR"/>
-        </w:rPr>
-        <w:t>Grafik 2: P, PI ve PID Kontrolörler İçin Hata Değişimi (e(t))</w:t>
-      </w:r>
-    </w:p>
-    <w:p>
-      <w:pPr>
-        <w:numPr>
-          <w:ilvl w:val="0"/>
-          <w:numId w:val="1"/>
-        </w:numPr>
-        <w:spacing w:before="100" w:beforeAutospacing="1" w:after="100" w:afterAutospacing="1" w:line="240" w:lineRule="auto"/>
-        <w:rPr>
-          <w:rFonts w:ascii="Times New Roman" w:eastAsia="Times New Roman" w:hAnsi="Times New Roman" w:cs="Times New Roman"/>
-          <w:sz w:val="24"/>
-          <w:szCs w:val="24"/>
-          <w:lang w:eastAsia="tr-TR"/>
-        </w:rPr>
-      </w:pPr>
-      <w:r>
-        <w:rPr>
-          <w:rFonts w:ascii="Times New Roman" w:eastAsia="Times New Roman" w:hAnsi="Times New Roman" w:cs="Times New Roman"/>
-          <w:b/>
-          <w:bCs/>
-          <w:sz w:val="24"/>
-          <w:szCs w:val="24"/>
-          <w:lang w:eastAsia="tr-TR"/>
-        </w:rPr>
-        <w:t>Grafik 3: Optimum PID Seti İçin Kontrol Sinyali $u(t)) Çıkışı</w:t>
-      </w:r>
+      </w:pPr>
     </w:p>
     <w:p>
       <w:pPr>
@@ -937,11 +1265,148 @@
           <w:szCs w:val="40"/>
         </w:rPr>
       </w:pPr>
-      <w:r>
+      <w:bookmarkStart w:id="0" w:name="_GoBack"/>
+      <w:bookmarkEnd w:id="0"/>
+    </w:p>
+    <w:p>
+      <w:pPr>
+        <w:pStyle w:val="NormalWeb"/>
+        <w:jc w:val="center"/>
         <w:rPr>
           <w:sz w:val="40"/>
           <w:szCs w:val="40"/>
         </w:rPr>
+      </w:pPr>
+      <w:r>
+        <w:rPr>
+          <w:sz w:val="40"/>
+          <w:szCs w:val="40"/>
+        </w:rPr>
+        <w:t>GRAFİKLER</w:t>
+      </w:r>
+    </w:p>
+    <w:p>
+      <w:pPr>
+        <w:pStyle w:val="NormalWeb"/>
+        <w:jc w:val="center"/>
+        <w:rPr>
+          <w:sz w:val="40"/>
+          <w:szCs w:val="40"/>
+        </w:rPr>
+      </w:pPr>
+    </w:p>
+    <w:p>
+      <w:pPr>
+        <w:pStyle w:val="NormalWeb"/>
+        <w:jc w:val="center"/>
+      </w:pPr>
+      <w:r>
+        <w:rPr>
+          <w:sz w:val="40"/>
+          <w:szCs w:val="40"/>
+        </w:rPr>
+        <w:drawing>
+          <wp:inline distT="0" distB="0" distL="0" distR="0" wp14:anchorId="23FE28D2" wp14:editId="67625738">
+            <wp:extent cx="5752421" cy="5280660"/>
+            <wp:effectExtent l="0" t="0" r="1270" b="0"/>
+            <wp:docPr id="1" name="Resim 1"/>
+            <wp:cNvGraphicFramePr>
+              <a:graphicFrameLocks xmlns:a="http://schemas.openxmlformats.org/drawingml/2006/main" noChangeAspect="1"/>
+            </wp:cNvGraphicFramePr>
+            <a:graphic xmlns:a="http://schemas.openxmlformats.org/drawingml/2006/main">
+              <a:graphicData uri="http://schemas.openxmlformats.org/drawingml/2006/picture">
+                <pic:pic xmlns:pic="http://schemas.openxmlformats.org/drawingml/2006/picture">
+                  <pic:nvPicPr>
+                    <pic:cNvPr id="1" name=""/>
+                    <pic:cNvPicPr/>
+                  </pic:nvPicPr>
+                  <pic:blipFill>
+                    <a:blip r:embed="rId6"/>
+                    <a:stretch>
+                      <a:fillRect/>
+                    </a:stretch>
+                  </pic:blipFill>
+                  <pic:spPr>
+                    <a:xfrm>
+                      <a:off x="0" y="0"/>
+                      <a:ext cx="5875493" cy="5393638"/>
+                    </a:xfrm>
+                    <a:prstGeom prst="rect">
+                      <a:avLst/>
+                    </a:prstGeom>
+                  </pic:spPr>
+                </pic:pic>
+              </a:graphicData>
+            </a:graphic>
+          </wp:inline>
+        </w:drawing>
+      </w:r>
+    </w:p>
+    <w:p>
+      <w:pPr>
+        <w:pStyle w:val="NormalWeb"/>
+        <w:jc w:val="center"/>
+        <w:rPr>
+          <w:sz w:val="40"/>
+          <w:szCs w:val="40"/>
+        </w:rPr>
+      </w:pPr>
+      <w:proofErr w:type="gramStart"/>
+      <w:r>
+        <w:t>şeklinde</w:t>
+      </w:r>
+      <w:proofErr w:type="gramEnd"/>
+      <w:r>
+        <w:t xml:space="preserve"> devam etmektedir</w:t>
+      </w:r>
+      <w:r>
+        <w:t>…</w:t>
+      </w:r>
+    </w:p>
+    <w:p>
+      <w:pPr>
+        <w:pStyle w:val="NormalWeb"/>
+        <w:jc w:val="center"/>
+        <w:rPr>
+          <w:sz w:val="40"/>
+          <w:szCs w:val="40"/>
+        </w:rPr>
+      </w:pPr>
+    </w:p>
+    <w:p>
+      <w:pPr>
+        <w:pStyle w:val="NormalWeb"/>
+        <w:jc w:val="center"/>
+        <w:rPr>
+          <w:sz w:val="40"/>
+          <w:szCs w:val="40"/>
+        </w:rPr>
+      </w:pPr>
+    </w:p>
+    <w:p>
+      <w:pPr>
+        <w:pStyle w:val="NormalWeb"/>
+        <w:rPr>
+          <w:sz w:val="40"/>
+          <w:szCs w:val="40"/>
+        </w:rPr>
+      </w:pPr>
+    </w:p>
+    <w:p>
+      <w:pPr>
+        <w:pStyle w:val="NormalWeb"/>
+        <w:jc w:val="center"/>
+        <w:rPr>
+          <w:sz w:val="40"/>
+          <w:szCs w:val="40"/>
+        </w:rPr>
+      </w:pPr>
+      <w:r>
+        <w:rPr>
+          <w:sz w:val="40"/>
+          <w:szCs w:val="40"/>
+        </w:rPr>
+        <w:lastRenderedPageBreak/>
         <w:t>KARŞILAŞTIRMA VE ANALİZLER</w:t>
       </w:r>
     </w:p>
@@ -1061,7 +1526,6 @@
           <w:szCs w:val="24"/>
           <w:lang w:eastAsia="tr-TR"/>
         </w:rPr>
-        <w:lastRenderedPageBreak/>
         <w:t>Virajlarda hata nasıl değişmektedir?</w:t>
       </w:r>
       <w:r>
@@ -1668,6 +2132,381 @@
     </w:p>
     <w:p>
       <w:pPr>
+        <w:numPr>
+          <w:ilvl w:val="0"/>
+          <w:numId w:val="2"/>
+        </w:numPr>
+        <w:spacing w:before="100" w:beforeAutospacing="1" w:after="100" w:afterAutospacing="1" w:line="240" w:lineRule="auto"/>
+        <w:rPr>
+          <w:rFonts w:ascii="Times New Roman" w:eastAsia="Times New Roman" w:hAnsi="Times New Roman" w:cs="Times New Roman"/>
+          <w:sz w:val="24"/>
+          <w:szCs w:val="24"/>
+          <w:lang w:eastAsia="tr-TR"/>
+        </w:rPr>
+      </w:pPr>
+      <w:r>
+        <w:rPr>
+          <w:rFonts w:ascii="Times New Roman" w:eastAsia="Times New Roman" w:hAnsi="Times New Roman" w:cs="Times New Roman"/>
+          <w:b/>
+          <w:bCs/>
+          <w:sz w:val="24"/>
+          <w:szCs w:val="24"/>
+          <w:lang w:eastAsia="tr-TR"/>
+        </w:rPr>
+        <w:t>Aracın kütlesi (örneğin 1 ton ile 100 ton arasındaki fark) sistemin davranışını nasıl etkilemektedir?</w:t>
+      </w:r>
+      <w:r>
+        <w:rPr>
+          <w:rFonts w:ascii="Times New Roman" w:eastAsia="Times New Roman" w:hAnsi="Times New Roman" w:cs="Times New Roman"/>
+          <w:sz w:val="24"/>
+          <w:szCs w:val="24"/>
+          <w:lang w:eastAsia="tr-TR"/>
+        </w:rPr>
+        <w:t xml:space="preserve"> Kinematik modelden dinamik modele geçildiğinde kütlenin (</w:t>
+      </w:r>
+      <w:r>
+        <w:rPr>
+          <w:rFonts w:ascii="Times New Roman" w:eastAsia="Times New Roman" w:hAnsi="Times New Roman" w:cs="Times New Roman"/>
+          <w:sz w:val="24"/>
+          <w:szCs w:val="24"/>
+          <w:lang w:eastAsia="tr-TR"/>
+        </w:rPr>
+        <w:t>m</w:t>
+      </w:r>
+      <w:r>
+        <w:rPr>
+          <w:rFonts w:ascii="Times New Roman" w:eastAsia="Times New Roman" w:hAnsi="Times New Roman" w:cs="Times New Roman"/>
+          <w:sz w:val="24"/>
+          <w:szCs w:val="24"/>
+          <w:lang w:eastAsia="tr-TR"/>
+        </w:rPr>
+        <w:t>) sistem kararlılığı üzerindeki kritik rolü açıkça görülmüştür. 1 tonluk (</w:t>
+      </w:r>
+      <w:r>
+        <w:rPr>
+          <w:rFonts w:ascii="Times New Roman" w:eastAsia="Times New Roman" w:hAnsi="Times New Roman" w:cs="Times New Roman"/>
+          <w:sz w:val="24"/>
+          <w:szCs w:val="24"/>
+          <w:lang w:eastAsia="tr-TR"/>
+        </w:rPr>
+        <w:t>1000</w:t>
+      </w:r>
+      <w:r>
+        <w:rPr>
+          <w:rFonts w:ascii="Times New Roman" w:eastAsia="Times New Roman" w:hAnsi="Times New Roman" w:cs="Times New Roman"/>
+          <w:sz w:val="24"/>
+          <w:szCs w:val="24"/>
+          <w:lang w:eastAsia="tr-TR"/>
+        </w:rPr>
+        <w:t xml:space="preserve"> kg) standart bir araç için belirlenen kontrol sinyali (</w:t>
+      </w:r>
+      <w:proofErr w:type="spellStart"/>
+      <w:r>
+        <w:rPr>
+          <w:rFonts w:ascii="Times New Roman" w:eastAsia="Times New Roman" w:hAnsi="Times New Roman" w:cs="Times New Roman"/>
+          <w:sz w:val="24"/>
+          <w:szCs w:val="24"/>
+          <w:lang w:eastAsia="tr-TR"/>
+        </w:rPr>
+        <w:t>Tork</w:t>
+      </w:r>
+      <w:proofErr w:type="spellEnd"/>
+      <w:r>
+        <w:rPr>
+          <w:rFonts w:ascii="Times New Roman" w:eastAsia="Times New Roman" w:hAnsi="Times New Roman" w:cs="Times New Roman"/>
+          <w:sz w:val="24"/>
+          <w:szCs w:val="24"/>
+          <w:lang w:eastAsia="tr-TR"/>
+        </w:rPr>
+        <w:t xml:space="preserve"> çarpanı) ve </w:t>
+      </w:r>
+      <w:proofErr w:type="spellStart"/>
+      <w:r>
+        <w:rPr>
+          <w:rFonts w:ascii="Times New Roman" w:eastAsia="Times New Roman" w:hAnsi="Times New Roman" w:cs="Times New Roman"/>
+          <w:sz w:val="24"/>
+          <w:szCs w:val="24"/>
+          <w:lang w:eastAsia="tr-TR"/>
+        </w:rPr>
+        <w:t>Kp</w:t>
+      </w:r>
+      <w:proofErr w:type="spellEnd"/>
+      <w:r>
+        <w:rPr>
+          <w:rFonts w:ascii="Times New Roman" w:eastAsia="Times New Roman" w:hAnsi="Times New Roman" w:cs="Times New Roman"/>
+          <w:sz w:val="24"/>
+          <w:szCs w:val="24"/>
+          <w:lang w:eastAsia="tr-TR"/>
+        </w:rPr>
+        <w:t xml:space="preserve">, </w:t>
+      </w:r>
+      <w:proofErr w:type="spellStart"/>
+      <w:r>
+        <w:rPr>
+          <w:rFonts w:ascii="Times New Roman" w:eastAsia="Times New Roman" w:hAnsi="Times New Roman" w:cs="Times New Roman"/>
+          <w:sz w:val="24"/>
+          <w:szCs w:val="24"/>
+          <w:lang w:eastAsia="tr-TR"/>
+        </w:rPr>
+        <w:t>Kd</w:t>
+      </w:r>
+      <w:proofErr w:type="spellEnd"/>
+      <w:r>
+        <w:rPr>
+          <w:rFonts w:ascii="Times New Roman" w:eastAsia="Times New Roman" w:hAnsi="Times New Roman" w:cs="Times New Roman"/>
+          <w:sz w:val="24"/>
+          <w:szCs w:val="24"/>
+          <w:lang w:eastAsia="tr-TR"/>
+        </w:rPr>
+        <w:t xml:space="preserve"> değerleri, araç 100 tona (</w:t>
+      </w:r>
+      <w:r>
+        <w:rPr>
+          <w:rFonts w:ascii="Times New Roman" w:eastAsia="Times New Roman" w:hAnsi="Times New Roman" w:cs="Times New Roman"/>
+          <w:sz w:val="24"/>
+          <w:szCs w:val="24"/>
+          <w:lang w:eastAsia="tr-TR"/>
+        </w:rPr>
+        <w:t>100.000</w:t>
+      </w:r>
+      <w:r>
+        <w:rPr>
+          <w:rFonts w:ascii="Times New Roman" w:eastAsia="Times New Roman" w:hAnsi="Times New Roman" w:cs="Times New Roman"/>
+          <w:sz w:val="24"/>
+          <w:szCs w:val="24"/>
+          <w:lang w:eastAsia="tr-TR"/>
+        </w:rPr>
+        <w:t xml:space="preserve"> kg) çıkarıldığında yetersiz kalmıştır. Kütlenin artmasıyla atalet momenti (</w:t>
+      </w:r>
+      <w:r>
+        <w:rPr>
+          <w:rFonts w:ascii="Times New Roman" w:eastAsia="Times New Roman" w:hAnsi="Times New Roman" w:cs="Times New Roman"/>
+          <w:sz w:val="24"/>
+          <w:szCs w:val="24"/>
+          <w:lang w:eastAsia="tr-TR"/>
+        </w:rPr>
+        <w:t>J</w:t>
+      </w:r>
+      <w:r>
+        <w:rPr>
+          <w:rFonts w:ascii="Times New Roman" w:eastAsia="Times New Roman" w:hAnsi="Times New Roman" w:cs="Times New Roman"/>
+          <w:sz w:val="24"/>
+          <w:szCs w:val="24"/>
+          <w:lang w:eastAsia="tr-TR"/>
+        </w:rPr>
+        <w:t xml:space="preserve">) devasa oranda büyümüş, aracın merkezkaç kuvvetine olan direnci kırılmış ve araç </w:t>
+      </w:r>
+      <w:proofErr w:type="gramStart"/>
+      <w:r>
+        <w:rPr>
+          <w:rFonts w:ascii="Times New Roman" w:eastAsia="Times New Roman" w:hAnsi="Times New Roman" w:cs="Times New Roman"/>
+          <w:sz w:val="24"/>
+          <w:szCs w:val="24"/>
+          <w:lang w:eastAsia="tr-TR"/>
+        </w:rPr>
+        <w:t>virajı</w:t>
+      </w:r>
+      <w:proofErr w:type="gramEnd"/>
+      <w:r>
+        <w:rPr>
+          <w:rFonts w:ascii="Times New Roman" w:eastAsia="Times New Roman" w:hAnsi="Times New Roman" w:cs="Times New Roman"/>
+          <w:sz w:val="24"/>
+          <w:szCs w:val="24"/>
+          <w:lang w:eastAsia="tr-TR"/>
+        </w:rPr>
+        <w:t xml:space="preserve"> alamayarak referans yörüngeden tamamen çıkmıştır. Bu durum, artan eylemsizliği yenebilmek (aracı döndürecek </w:t>
+      </w:r>
+      <w:proofErr w:type="spellStart"/>
+      <w:r>
+        <w:rPr>
+          <w:rFonts w:ascii="Times New Roman" w:eastAsia="Times New Roman" w:hAnsi="Times New Roman" w:cs="Times New Roman"/>
+          <w:sz w:val="24"/>
+          <w:szCs w:val="24"/>
+          <w:lang w:eastAsia="tr-TR"/>
+        </w:rPr>
+        <w:t>açısal</w:t>
+      </w:r>
+      <w:proofErr w:type="spellEnd"/>
+      <w:r>
+        <w:rPr>
+          <w:rFonts w:ascii="Times New Roman" w:eastAsia="Times New Roman" w:hAnsi="Times New Roman" w:cs="Times New Roman"/>
+          <w:sz w:val="24"/>
+          <w:szCs w:val="24"/>
+          <w:lang w:eastAsia="tr-TR"/>
+        </w:rPr>
+        <w:t xml:space="preserve"> ivmeyi elde edebilmek) için Dinamik Denklemdeki</w:t>
+      </w:r>
+      <w:r>
+        <w:rPr>
+          <w:rFonts w:ascii="Times New Roman" w:eastAsia="Times New Roman" w:hAnsi="Times New Roman" w:cs="Times New Roman"/>
+          <w:sz w:val="24"/>
+          <w:szCs w:val="24"/>
+          <w:lang w:eastAsia="tr-TR"/>
+        </w:rPr>
+        <w:t xml:space="preserve"> (</w:t>
+      </w:r>
+      <w:r>
+        <w:t xml:space="preserve">τ = </w:t>
+      </w:r>
+      <w:proofErr w:type="spellStart"/>
+      <w:r>
+        <w:t>Jθ</w:t>
+      </w:r>
+      <w:proofErr w:type="spellEnd"/>
+      <w:r>
+        <w:t xml:space="preserve">̈ + </w:t>
+      </w:r>
+      <w:proofErr w:type="spellStart"/>
+      <w:r>
+        <w:t>bθ</w:t>
+      </w:r>
+      <w:proofErr w:type="spellEnd"/>
+      <w:r>
+        <w:t>̇</w:t>
+      </w:r>
+      <w:r>
+        <w:rPr>
+          <w:rFonts w:ascii="Times New Roman" w:eastAsia="Times New Roman" w:hAnsi="Times New Roman" w:cs="Times New Roman"/>
+          <w:sz w:val="24"/>
+          <w:szCs w:val="24"/>
+          <w:lang w:eastAsia="tr-TR"/>
+        </w:rPr>
+        <w:t xml:space="preserve">) </w:t>
+      </w:r>
+      <w:proofErr w:type="spellStart"/>
+      <w:r>
+        <w:rPr>
+          <w:rFonts w:ascii="Times New Roman" w:eastAsia="Times New Roman" w:hAnsi="Times New Roman" w:cs="Times New Roman"/>
+          <w:sz w:val="24"/>
+          <w:szCs w:val="24"/>
+          <w:lang w:eastAsia="tr-TR"/>
+        </w:rPr>
+        <w:t>Tork</w:t>
+      </w:r>
+      <w:proofErr w:type="spellEnd"/>
+      <w:r>
+        <w:rPr>
+          <w:rFonts w:ascii="Times New Roman" w:eastAsia="Times New Roman" w:hAnsi="Times New Roman" w:cs="Times New Roman"/>
+          <w:sz w:val="24"/>
+          <w:szCs w:val="24"/>
+          <w:lang w:eastAsia="tr-TR"/>
+        </w:rPr>
+        <w:t xml:space="preserve"> ihtiyacının kütle ile doğru orantılı olarak arttığını kanıtlamıştır. 100 tonluk sistemi şeritte tutabilmek için kontrolcü kas gücünün </w:t>
+      </w:r>
+      <w:r>
+        <w:rPr>
+          <w:rFonts w:ascii="Times New Roman" w:eastAsia="Times New Roman" w:hAnsi="Times New Roman" w:cs="Times New Roman"/>
+          <w:sz w:val="24"/>
+          <w:szCs w:val="24"/>
+          <w:lang w:eastAsia="tr-TR"/>
+        </w:rPr>
+        <w:lastRenderedPageBreak/>
+        <w:t>(</w:t>
+      </w:r>
+      <w:proofErr w:type="spellStart"/>
+      <w:r>
+        <w:rPr>
+          <w:rFonts w:ascii="Times New Roman" w:eastAsia="Times New Roman" w:hAnsi="Times New Roman" w:cs="Times New Roman"/>
+          <w:sz w:val="24"/>
+          <w:szCs w:val="24"/>
+          <w:lang w:eastAsia="tr-TR"/>
+        </w:rPr>
+        <w:t>Tork</w:t>
+      </w:r>
+      <w:proofErr w:type="spellEnd"/>
+      <w:r>
+        <w:rPr>
+          <w:rFonts w:ascii="Times New Roman" w:eastAsia="Times New Roman" w:hAnsi="Times New Roman" w:cs="Times New Roman"/>
+          <w:sz w:val="24"/>
+          <w:szCs w:val="24"/>
+          <w:lang w:eastAsia="tr-TR"/>
+        </w:rPr>
+        <w:t xml:space="preserve"> çarpanı) ve hata tepkisinin (</w:t>
+      </w:r>
+      <w:proofErr w:type="spellStart"/>
+      <w:r>
+        <w:rPr>
+          <w:rFonts w:ascii="Times New Roman" w:eastAsia="Times New Roman" w:hAnsi="Times New Roman" w:cs="Times New Roman"/>
+          <w:sz w:val="24"/>
+          <w:szCs w:val="24"/>
+          <w:lang w:eastAsia="tr-TR"/>
+        </w:rPr>
+        <w:t>Kp</w:t>
+      </w:r>
+      <w:proofErr w:type="spellEnd"/>
+      <w:r>
+        <w:rPr>
+          <w:rFonts w:ascii="Times New Roman" w:eastAsia="Times New Roman" w:hAnsi="Times New Roman" w:cs="Times New Roman"/>
+          <w:sz w:val="24"/>
+          <w:szCs w:val="24"/>
+          <w:lang w:eastAsia="tr-TR"/>
+        </w:rPr>
+        <w:t xml:space="preserve">, </w:t>
+      </w:r>
+      <w:proofErr w:type="spellStart"/>
+      <w:r>
+        <w:rPr>
+          <w:rFonts w:ascii="Times New Roman" w:eastAsia="Times New Roman" w:hAnsi="Times New Roman" w:cs="Times New Roman"/>
+          <w:sz w:val="24"/>
+          <w:szCs w:val="24"/>
+          <w:lang w:eastAsia="tr-TR"/>
+        </w:rPr>
+        <w:t>Kd</w:t>
+      </w:r>
+      <w:proofErr w:type="spellEnd"/>
+      <w:r>
+        <w:rPr>
+          <w:rFonts w:ascii="Times New Roman" w:eastAsia="Times New Roman" w:hAnsi="Times New Roman" w:cs="Times New Roman"/>
+          <w:sz w:val="24"/>
+          <w:szCs w:val="24"/>
+          <w:lang w:eastAsia="tr-TR"/>
+        </w:rPr>
+        <w:t xml:space="preserve"> </w:t>
+      </w:r>
+      <w:r>
+        <w:rPr>
+          <w:rFonts w:ascii="Times New Roman" w:eastAsia="Times New Roman" w:hAnsi="Times New Roman" w:cs="Times New Roman"/>
+          <w:sz w:val="24"/>
+          <w:szCs w:val="24"/>
+          <w:lang w:eastAsia="tr-TR"/>
+        </w:rPr>
+        <w:t>kazançlarının) kütledeki artış oranına uygun olarak yeniden ayarlanması (</w:t>
+      </w:r>
+      <w:proofErr w:type="spellStart"/>
+      <w:r>
+        <w:rPr>
+          <w:rFonts w:ascii="Times New Roman" w:eastAsia="Times New Roman" w:hAnsi="Times New Roman" w:cs="Times New Roman"/>
+          <w:sz w:val="24"/>
+          <w:szCs w:val="24"/>
+          <w:lang w:eastAsia="tr-TR"/>
+        </w:rPr>
+        <w:t>tune</w:t>
+      </w:r>
+      <w:proofErr w:type="spellEnd"/>
+      <w:r>
+        <w:rPr>
+          <w:rFonts w:ascii="Times New Roman" w:eastAsia="Times New Roman" w:hAnsi="Times New Roman" w:cs="Times New Roman"/>
+          <w:sz w:val="24"/>
+          <w:szCs w:val="24"/>
+          <w:lang w:eastAsia="tr-TR"/>
+        </w:rPr>
+        <w:t xml:space="preserve"> edilmesi) gerekmiştir.</w:t>
+      </w:r>
+    </w:p>
+    <w:p>
+      <w:pPr>
+        <w:spacing w:before="100" w:beforeAutospacing="1" w:after="100" w:afterAutospacing="1" w:line="240" w:lineRule="auto"/>
+        <w:ind w:left="720"/>
+        <w:rPr>
+          <w:rFonts w:ascii="Times New Roman" w:eastAsia="Times New Roman" w:hAnsi="Times New Roman" w:cs="Times New Roman"/>
+          <w:sz w:val="24"/>
+          <w:szCs w:val="24"/>
+          <w:lang w:eastAsia="tr-TR"/>
+        </w:rPr>
+      </w:pPr>
+    </w:p>
+    <w:p>
+      <w:pPr>
         <w:pStyle w:val="NormalWeb"/>
         <w:jc w:val="center"/>
         <w:rPr>
@@ -1685,11 +2524,41 @@
           <w:szCs w:val="40"/>
         </w:rPr>
       </w:pPr>
-      <w:r>
+    </w:p>
+    <w:p>
+      <w:pPr>
+        <w:pStyle w:val="NormalWeb"/>
+        <w:jc w:val="center"/>
         <w:rPr>
           <w:sz w:val="40"/>
           <w:szCs w:val="40"/>
         </w:rPr>
+      </w:pPr>
+    </w:p>
+    <w:p>
+      <w:pPr>
+        <w:pStyle w:val="NormalWeb"/>
+        <w:jc w:val="center"/>
+        <w:rPr>
+          <w:sz w:val="40"/>
+          <w:szCs w:val="40"/>
+        </w:rPr>
+      </w:pPr>
+    </w:p>
+    <w:p>
+      <w:pPr>
+        <w:pStyle w:val="NormalWeb"/>
+        <w:jc w:val="center"/>
+        <w:rPr>
+          <w:sz w:val="40"/>
+          <w:szCs w:val="40"/>
+        </w:rPr>
+      </w:pPr>
+      <w:r>
+        <w:rPr>
+          <w:sz w:val="40"/>
+          <w:szCs w:val="40"/>
+        </w:rPr>
         <w:t>SONUÇ</w:t>
       </w:r>
     </w:p>
@@ -1768,19 +2637,17 @@
           <w:szCs w:val="24"/>
           <w:lang w:eastAsia="tr-TR"/>
         </w:rPr>
-        <w:t xml:space="preserve"> katsayılarının etkilerinin, sanal da olsa fiziksel bir sistemde birebir gözlemlenebildiğini kanıtlamıştır. Gelecek çalışmalarda, daha gelişmiş bulanık mantık (</w:t>
-      </w:r>
-      <w:proofErr w:type="spellStart"/>
-      <w:r>
-        <w:rPr>
-          <w:rFonts w:ascii="Times New Roman" w:eastAsia="Times New Roman" w:hAnsi="Times New Roman" w:cs="Times New Roman"/>
-          <w:sz w:val="24"/>
-          <w:szCs w:val="24"/>
-          <w:lang w:eastAsia="tr-TR"/>
-        </w:rPr>
-        <w:t>fuzzy</w:t>
-      </w:r>
-      <w:proofErr w:type="spellEnd"/>
+        <w:t xml:space="preserve"> katsayılarının etkilerinin, sanal da olsa fiziksel bir sistemde birebir gözlemlenebildiğini kanıtlamıştır</w:t>
+      </w:r>
+      <w:r>
+        <w:rPr>
+          <w:rFonts w:ascii="Times New Roman" w:eastAsia="Times New Roman" w:hAnsi="Times New Roman" w:cs="Times New Roman"/>
+          <w:sz w:val="24"/>
+          <w:szCs w:val="24"/>
+          <w:lang w:eastAsia="tr-TR"/>
+        </w:rPr>
+        <w:t>.</w:t>
+      </w:r>
       <w:r>
         <w:rPr>
           <w:rFonts w:ascii="Times New Roman" w:eastAsia="Times New Roman" w:hAnsi="Times New Roman" w:cs="Times New Roman"/>
@@ -1790,73 +2657,11 @@
         </w:rPr>
         <w:t xml:space="preserve"> </w:t>
       </w:r>
-      <w:proofErr w:type="spellStart"/>
-      <w:r>
-        <w:rPr>
-          <w:rFonts w:ascii="Times New Roman" w:eastAsia="Times New Roman" w:hAnsi="Times New Roman" w:cs="Times New Roman"/>
-          <w:sz w:val="24"/>
-          <w:szCs w:val="24"/>
-          <w:lang w:eastAsia="tr-TR"/>
-        </w:rPr>
-        <w:t>logic</w:t>
-      </w:r>
-      <w:proofErr w:type="spellEnd"/>
-      <w:r>
-        <w:rPr>
-          <w:rFonts w:ascii="Times New Roman" w:eastAsia="Times New Roman" w:hAnsi="Times New Roman" w:cs="Times New Roman"/>
-          <w:sz w:val="24"/>
-          <w:szCs w:val="24"/>
-          <w:lang w:eastAsia="tr-TR"/>
-        </w:rPr>
-        <w:t xml:space="preserve">) veya yapay sinir ağı tabanlı </w:t>
-      </w:r>
-      <w:proofErr w:type="spellStart"/>
-      <w:r>
-        <w:rPr>
-          <w:rFonts w:ascii="Times New Roman" w:eastAsia="Times New Roman" w:hAnsi="Times New Roman" w:cs="Times New Roman"/>
-          <w:sz w:val="24"/>
-          <w:szCs w:val="24"/>
-          <w:lang w:eastAsia="tr-TR"/>
-        </w:rPr>
-        <w:t>adaptif</w:t>
-      </w:r>
-      <w:proofErr w:type="spellEnd"/>
-      <w:r>
-        <w:rPr>
-          <w:rFonts w:ascii="Times New Roman" w:eastAsia="Times New Roman" w:hAnsi="Times New Roman" w:cs="Times New Roman"/>
-          <w:sz w:val="24"/>
-          <w:szCs w:val="24"/>
-          <w:lang w:eastAsia="tr-TR"/>
-        </w:rPr>
-        <w:t xml:space="preserve"> kontrolcülerin bu modele </w:t>
-      </w:r>
-      <w:proofErr w:type="gramStart"/>
-      <w:r>
-        <w:rPr>
-          <w:rFonts w:ascii="Times New Roman" w:eastAsia="Times New Roman" w:hAnsi="Times New Roman" w:cs="Times New Roman"/>
-          <w:sz w:val="24"/>
-          <w:szCs w:val="24"/>
-          <w:lang w:eastAsia="tr-TR"/>
-        </w:rPr>
-        <w:t>entegre</w:t>
-      </w:r>
-      <w:proofErr w:type="gramEnd"/>
-      <w:r>
-        <w:rPr>
-          <w:rFonts w:ascii="Times New Roman" w:eastAsia="Times New Roman" w:hAnsi="Times New Roman" w:cs="Times New Roman"/>
-          <w:sz w:val="24"/>
-          <w:szCs w:val="24"/>
-          <w:lang w:eastAsia="tr-TR"/>
-        </w:rPr>
-        <w:t xml:space="preserve"> edilmesi yörünge takip performansını daha da artıracaktır. </w:t>
-      </w:r>
-    </w:p>
-    <w:p>
-      <w:pPr>
-        <w:pStyle w:val="NormalWeb"/>
-      </w:pPr>
-      <w:bookmarkStart w:id="0" w:name="_GoBack"/>
-      <w:bookmarkEnd w:id="0"/>
+    </w:p>
+    <w:p>
+      <w:pPr>
+        <w:pStyle w:val="NormalWeb"/>
+      </w:pPr>
     </w:p>
     <w:p>
       <w:pPr>
@@ -2590,6 +3395,29 @@
     <w:name w:val="Normal"/>
     <w:qFormat/>
   </w:style>
+  <w:style w:type="paragraph" w:styleId="Balk2">
+    <w:name w:val="heading 2"/>
+    <w:basedOn w:val="Normal"/>
+    <w:next w:val="Normal"/>
+    <w:link w:val="Balk2Char"/>
+    <w:uiPriority w:val="9"/>
+    <w:semiHidden/>
+    <w:unhideWhenUsed/>
+    <w:qFormat/>
+    <w:rsid w:val="0087604A"/>
+    <w:pPr>
+      <w:keepNext/>
+      <w:keepLines/>
+      <w:spacing w:before="40" w:after="0"/>
+      <w:outlineLvl w:val="1"/>
+    </w:pPr>
+    <w:rPr>
+      <w:rFonts w:asciiTheme="majorHAnsi" w:eastAsiaTheme="majorEastAsia" w:hAnsiTheme="majorHAnsi" w:cstheme="majorBidi"/>
+      <w:color w:val="2E74B5" w:themeColor="accent1" w:themeShade="BF"/>
+      <w:sz w:val="26"/>
+      <w:szCs w:val="26"/>
+    </w:rPr>
+  </w:style>
   <w:style w:type="paragraph" w:styleId="Balk3">
     <w:name w:val="heading 3"/>
     <w:basedOn w:val="Normal"/>
@@ -2691,7 +3519,6 @@
     <w:name w:val="Normal (Web)"/>
     <w:basedOn w:val="Normal"/>
     <w:uiPriority w:val="99"/>
-    <w:semiHidden/>
     <w:unhideWhenUsed/>
     <w:rsid w:val="00C74E5C"/>
     <w:pPr>
@@ -2732,6 +3559,31 @@
       <w:b/>
       <w:bCs/>
     </w:rPr>
+  </w:style>
+  <w:style w:type="character" w:customStyle="1" w:styleId="Balk2Char">
+    <w:name w:val="Başlık 2 Char"/>
+    <w:basedOn w:val="VarsaylanParagrafYazTipi"/>
+    <w:link w:val="Balk2"/>
+    <w:uiPriority w:val="9"/>
+    <w:semiHidden/>
+    <w:rsid w:val="0087604A"/>
+    <w:rPr>
+      <w:rFonts w:asciiTheme="majorHAnsi" w:eastAsiaTheme="majorEastAsia" w:hAnsiTheme="majorHAnsi" w:cstheme="majorBidi"/>
+      <w:color w:val="2E74B5" w:themeColor="accent1" w:themeShade="BF"/>
+      <w:sz w:val="26"/>
+      <w:szCs w:val="26"/>
+    </w:rPr>
+  </w:style>
+  <w:style w:type="paragraph" w:styleId="ListeParagraf">
+    <w:name w:val="List Paragraph"/>
+    <w:basedOn w:val="Normal"/>
+    <w:uiPriority w:val="34"/>
+    <w:qFormat/>
+    <w:rsid w:val="0087604A"/>
+    <w:pPr>
+      <w:ind w:left="720"/>
+      <w:contextualSpacing/>
+    </w:pPr>
   </w:style>
 </w:styles>
 </file>

</xml_diff>